<commit_message>
feat: enhance testing guidelines and add error handling tests for session actions
</commit_message>
<xml_diff>
--- a/chargingstationsapp DEMO.docx
+++ b/chargingstationsapp DEMO.docx
@@ -8,6 +8,9 @@
       </w:r>
     </w:p>
     <w:p>
+      <w:r>
+        <w:t xml:space="preserve">Open source tools, TypeScript client &amp; server side, </w:t>
+      </w:r>
       <w:r>
         <w:t>Clerk Auth, Neon db for Postgres, Shadcn UI</w:t>
       </w:r>
@@ -168,6 +171,18 @@
       </w:pPr>
       <w:r>
         <w:t>MySQL instead of Neon Postgres</w:t>
+      </w:r>
+    </w:p>
+    <w:p>
+      <w:pPr>
+        <w:pStyle w:val="ListParagraph"/>
+        <w:numPr>
+          <w:ilvl w:val="0"/>
+          <w:numId w:val="1"/>
+        </w:numPr>
+      </w:pPr>
+      <w:r>
+        <w:t>SCA, SAST, SAST</w:t>
       </w:r>
     </w:p>
     <w:p>

</xml_diff>